<commit_message>
Unify table setup, keep previews visible and add player tile backgrounds
</commit_message>
<xml_diff>
--- a/Documentation/User Manual/TurnHub Manual V0.20.docx
+++ b/Documentation/User Manual/TurnHub Manual V0.20.docx
@@ -3740,13 +3740,13 @@
       </ns0:r>
       <ns0:r>
         <ns0:rPr/>
-        <ns0:t xml:space="preserve"> in My account. Use the arrows to set turn order; panels sit clockwise in that order. Then choose the game, starting life and Two-Headed Giant, and tap </ns0:t>
+        <ns0:t xml:space="preserve"> in My account. The table preview stays visible while players join. Drag one player onto another seat, or tap two seats, to swap them; panels sit clockwise in number order. Clear all removes seated accounts through Atlas. Saved accounts remain available. Then choose the game, starting life and Two-Headed Giant, and tap </ns0:t>
       </ns0:r>
       <ns0:r>
         <ns0:rPr>
           <ns0:b/>
         </ns0:rPr>
-        <ns0:t>Start the game</ns0:t>
+        <ns0:t>Start full-screen game</ns0:t>
       </ns0:r>
       <ns0:r>
         <ns0:rPr/>
@@ -4013,17 +4013,22 @@
       </ns0:pPr>
       <ns0:r>
         <ns0:rPr/>
-        <ns0:t xml:space="preserve">Use the arrows to set turn order, choose the game and starting life, and tap </ns0:t>
+        <ns0:t xml:space="preserve">The table preview stays visible even with zero or one player. Drag a player onto another seat, or tap two seats, to swap their positions. Clear all removes the selected players in one step and preserves saved accounts, history and game settings. Choose the game and starting life, and tap </ns0:t>
       </ns0:r>
       <ns0:r>
         <ns0:rPr>
           <ns0:b/>
         </ns0:rPr>
-        <ns0:t>Start the game</ns0:t>
+        <ns0:t>Start full-screen game</ns0:t>
       </ns0:r>
       <ns0:r>
         <ns0:rPr/>
         <ns0:t>.</ns0:t>
+      </ns0:r>
+    </ns0:p>
+    <ns0:p>
+      <ns0:r>
+        <ns0:t>Each player's Background button opens their tile settings. Choose Default, Solid, Gradient or a custom cropped image. Backgrounds follow the player across seats and games and stay separate from avatars. Images are saved on this phone at up to 512 by 512 pixels and 48 KiB. Account settings also offer tile backgrounds; an account PIN is required if one is set. A verified link to an Atlas account applies the same background on this phone's connected table.</ns0:t>
       </ns0:r>
     </ns0:p>
     <ns0:p>

</xml_diff>

<commit_message>
Add shared foreground game-action sounds with phone mute and volume controls
</commit_message>
<xml_diff>
--- a/Documentation/User Manual/TurnHub Manual V0.20.docx
+++ b/Documentation/User Manual/TurnHub Manual V0.20.docx
@@ -4029,6 +4029,11 @@
     <ns0:p>
       <ns0:r>
         <ns0:t>Each player's Background button opens their tile settings. Choose Default, Solid, Gradient or a custom cropped image. Backgrounds follow the player across seats and games and stay separate from avatars. Images are saved on this phone at up to 512 by 512 pixels and 48 KiB. Account settings also offer tile backgrounds; an account PIN is required if one is set. A verified link to an Atlas account applies the same background on this phone's connected table.</ns0:t>
+      </ns0:r>
+    </ns0:p>
+    <ns0:p>
+      <ns0:r>
+        <ns0:t>The app plays short sounds for confirmed passes, game starts, pauses, resumes, victories and draws in both local and Atlas-connected play. Game sounds and Sound volume are available in table setup, the table menu and My account. They are saved on this phone and default to on at 50%. Phone silent/vibrate mode and media volume still apply. Sounds stop when the app leaves the foreground and do not replay on load, reconnect or return to the app. All actions still show on screen; sound is optional.</ns0:t>
       </ns0:r>
     </ns0:p>
     <ns0:p>

</xml_diff>

<commit_message>
Android lobby: choose who goes first
Each lobby player gets a First? chip. In the standalone game the chosen
player (their team, in Two-Headed Giant) starts, and the choice follows
swaps and removals; with nobody chosen, and on a rematch, the start stays
random. Connected tablet mode sends Atlas's existing "starter" control for
that player's seat (Atlas otherwise starts with player 1).

Co-Authored-By: Claude Opus 5.5 (1M context) <noreply@anthropic.com>
Claude-Session: https://claude.ai/code/session_01QMsfBN1QqQJCnnSo8grRA9
</commit_message>
<xml_diff>
--- a/Documentation/User Manual/TurnHub Manual V0.20.docx
+++ b/Documentation/User Manual/TurnHub Manual V0.20.docx
@@ -3740,7 +3740,7 @@
       </ns0:r>
       <ns0:r>
         <ns0:rPr/>
-        <ns0:t xml:space="preserve"> in My account. The table preview stays visible while players join. Drag one player onto another seat, or tap two seats, to swap them; panels sit clockwise in number order. Clear all removes seated accounts through Atlas. Saved accounts remain available. Then choose the game, starting life and Two-Headed Giant, and tap </ns0:t>
+        <ns0:t xml:space="preserve"> in My account. The table preview stays visible while players join. Drag one player onto another seat, or tap two seats, to swap them; panels sit clockwise in number order. Tap First? next to a player to choose who goes first; otherwise player 1 starts. Clear all removes seated accounts through Atlas. Saved accounts remain available. Then choose the game, starting life and Two-Headed Giant, and tap </ns0:t>
       </ns0:r>
       <ns0:r>
         <ns0:rPr>
@@ -4049,7 +4049,7 @@
       </ns0:pPr>
       <ns0:r>
         <ns0:rPr/>
-        <ns0:t>The table looks and works like tablet mode (section 17): life, Commander damage, passing, pause, concede, the turn timer, Two-Headed Giant, Star Commander and the winners. There are no phones or Sigils in this mode. Official modes (Magic, Commander, Two-Headed Giant and Yu-Gi-Oh!) use their official starting life, poison limit and player count unless House rules is on in setup; official Two-Headed Giant is two teams of two. Two-Headed Giant Commander, Star Commander and Other are custom modes. In Two-Headed Giant the More menu shows the team's shared poison once and one Our team concedes button, because a team leaves together; teammates can't deal each other Commander damage. ? Rules, in setup and the table menu, summarizes the mode's rules and links to the official rules.</ns0:t>
+        <ns0:t>The table looks and works like tablet mode (section 17): life, Commander damage, passing, pause, concede, the turn timer, Two-Headed Giant, Star Commander and the winners. There are no phones or Sigils in this mode. Tap First? next to a player in setup to choose who goes first (their team, in Two-Headed Giant); otherwise a random player starts, and a rematch always picks at random. Official modes (Magic, Commander, Two-Headed Giant and Yu-Gi-Oh!) use their official starting life, poison limit and player count unless House rules is on in setup; official Two-Headed Giant is two teams of two. Two-Headed Giant Commander, Star Commander and Other are custom modes. In Two-Headed Giant the More menu shows the team's shared poison once and one Our team concedes button, because a team leaves together; teammates can't deal each other Commander damage. ? Rules, in setup and the table menu, summarizes the mode's rules and links to the official rules.</ns0:t>
       </ns0:r>
     </ns0:p>
     <ns0:p>

</xml_diff>

<commit_message>
Atlas: official rules with House rules, random starter, no teammate Commander damage
Ports the standalone app's rules (#112) to Atlas so connected games match:
- Official modes (Magic 20/10, Commander 40/10, Two-Headed Giant Magic 30/15
  with exactly two teams of two, Yu-Gi-Oh! 8000 with two players) keep their
  official life, poison limit and table size unless House rules are on
  (GameSettings::houseRules, /api/game/settings houseRules, gamecfg and
  recovery flag bit 4). Custom modes stay editable.
- Two-Headed Giant: a teammate is never a source of Commander damage.
- Nobody chosen to go first: Atlas picks a random player at the start;
  choosing the chosen player again clears the choice.
- Android connected: House rules switch in the tablet lobby and the phone's
  Game setup; locked limits on the connected table; parser reads houseRules.

Co-Authored-By: Claude Opus 5.5 (1M context) <noreply@anthropic.com>
Claude-Session: https://claude.ai/code/session_01KAwCJomNqCVgXMJHcDU8fr
</commit_message>
<xml_diff>
--- a/Documentation/User Manual/TurnHub Manual V0.20.docx
+++ b/Documentation/User Manual/TurnHub Manual V0.20.docx
@@ -1723,7 +1723,7 @@
         </ns0:rPr>
       </ns0:pPr>
       <ns0:r>
-        <ns0:t>Optionally choose who goes first: Next starter or Random start on a Sigil, or I go first in the Android app.</ns0:t>
+        <ns0:t>Optionally choose who goes first: Next starter or Random start on a Sigil, or I go first in the Android app. If nobody is chosen, Atlas picks a random player when the game starts.</ns0:t>
       </ns0:r>
       <ns0:r>
         <ns0:rPr>
@@ -1890,7 +1890,7 @@
         </ns0:rPr>
       </ns0:pPr>
       <ns0:r>
-        <ns0:t>Custom starting life: any whole number from 0 to 1,000,000</ns0:t>
+        <ns0:t>Custom starting life: any whole number from 0 to 1,000,000 for Generic, Star Commander and Two-Headed Giant Commander, or with House rules on. Without House rules, Magic, Commander, Two-Headed Giant and Yu-Gi-Oh! keep their official starting life and poison limit; official Two-Headed Giant is two teams of two and a Yu-Gi-Oh! Duel is two players. Turn on House rules in Game setup, or in the tablet lobby, to change them.</ns0:t>
       </ns0:r>
     </ns0:p>
     <ns0:p>
@@ -1921,7 +1921,7 @@
         </ns0:rPr>
       </ns0:pPr>
       <ns0:r>
-        <ns0:t>Teammates share one life total: 30 for Magic, 60 for Commander (you can change it). Either teammate can change it.</ns0:t>
+        <ns0:t>Teammates share one life total: 30 for Magic (official; House rules unlock it), 60 for Commander (you can change it). Teammates can't deal each other Commander damage. Either teammate can change it.</ns0:t>
       </ns0:r>
     </ns0:p>
     <ns0:p>
@@ -3740,7 +3740,7 @@
       </ns0:r>
       <ns0:r>
         <ns0:rPr/>
-        <ns0:t xml:space="preserve"> in My account. The table preview stays visible while players join. Drag one player onto another seat, or tap two seats, to swap them; panels sit clockwise in number order. Tap First? next to a player to choose who goes first; otherwise player 1 starts. Clear all removes seated accounts through Atlas. Saved accounts remain available. Then choose the game, starting life and Two-Headed Giant, and tap </ns0:t>
+        <ns0:t xml:space="preserve"> in My account. The table preview stays visible while players join. Drag one player onto another seat, or tap two seats, to swap them; panels sit clockwise in number order. Tap First? next to a player to choose who goes first, and tap it again to clear the choice; otherwise Atlas picks a random player. Clear all removes seated accounts through Atlas. Saved accounts remain available. Then choose the game, starting life and Two-Headed Giant, and tap </ns0:t>
       </ns0:r>
       <ns0:r>
         <ns0:rPr>

</xml_diff>

<commit_message>
Unify Android navigation and polish local table controls
</commit_message>
<xml_diff>
--- a/Documentation/User Manual/TurnHub Manual V0.20.docx
+++ b/Documentation/User Manual/TurnHub Manual V0.20.docx
@@ -1089,7 +1089,7 @@
         <ns0:pStyle ns0:val="NormalWeb"/>
       </ns0:pPr>
       <ns0:r>
-        <ns0:t>The TurnHub Android app is on Google Play through the prototype testing track. It opens directly to your local full-screen table, including a saved game. No Atlas, account or network permission is needed. Atlas discovery runs quietly on the current network if a saved table and permission are available. It never opens Wi-Fi or permission dialogs or replaces local play. Choose Atlas in the local lobby when you want connected play; an explicit connection can join TurnHub-Atlas Wi-Fi using the saved password, TurnHub-Setup, or a password you enter.</ns0:t>
+        <ns0:t>The TurnHub Android app is on Google Play through the prototype testing track. Game, Table, Players, History and Settings are available with or without Atlas. No Atlas, account or network permission is needed for local play. Table opens the full-screen view. Settings includes appearance, sound and Atlas connection. Atlas discovery stays in the background; Connect can join TurnHub-Atlas Wi-Fi using a saved or entered password.</ns0:t>
       </ns0:r>
     </ns0:p>
     <ns0:p>
@@ -3982,22 +3982,22 @@
         <ns0:pStyle ns0:val="NormalWeb"/>
       </ns0:pPr>
       <ns0:r>
-        <ns0:t>The Android app opens directly to the full-screen table on every fresh launch. Add players and start, or continue the saved local game. Atlas discovery is a background task and does not interrupt this screen. The lobby has an Atlas button for connected play and a switch to hide Atlas entirely. A local game remains separate from every Atlas game.</ns0:t>
-      </ns0:r>
-    </ns0:p>
-    <ns0:p>
-      <ns0:pPr>
-        <ns0:numPr>
-          <ns0:ilvl ns0:val="0"/>
-          <ns0:numId ns0:val="1"/>
-        </ns0:numPr>
-        <ns0:spacing ns0:before="100" ns0:beforeAutospacing="1" ns0:after="100" ns0:afterAutospacing="1" ns0:line="240" ns0:lineRule="auto"/>
-        <ns0:rPr>
-          <ns0:rFonts ns0:eastAsia="Times New Roman"/>
-        </ns0:rPr>
-      </ns0:pPr>
-      <ns0:r>
-        <ns0:t>Type a name in the lobby to create a reusable local player, or select a saved player. Accounts and history also lets you create accounts without starting a game. Every account has a stable local identity and an eight-character hexadecimal account ID. Equal names remain separate. A PIN or password is optional for local account settings; use a 4–8 digit PIN or an 8–64 byte password. Shared-table play remains available without signing in. PIN-protected account settings need unlocking after the app restarts.</ns0:t>
+        <ns0:t>The Android app opens to Game on a fresh launch. Add players and start, or open a saved game from Table. These same tabs remain available when Atlas connects. Game lets you choose This device or Atlas; Players adds Table and Me sections, and Settings adds authorized table administration. Turning off Atlas discovery disconnects it. Local games and Atlas games remain independent.</ns0:t>
+      </ns0:r>
+    </ns0:p>
+    <ns0:p>
+      <ns0:pPr>
+        <ns0:numPr>
+          <ns0:ilvl ns0:val="0"/>
+          <ns0:numId ns0:val="1"/>
+        </ns0:numPr>
+        <ns0:spacing ns0:before="100" ns0:beforeAutospacing="1" ns0:after="100" ns0:afterAutospacing="1" ns0:line="240" ns0:lineRule="auto"/>
+        <ns0:rPr>
+          <ns0:rFonts ns0:eastAsia="Times New Roman"/>
+        </ns0:rPr>
+      </ns0:pPr>
+      <ns0:r>
+        <ns0:t>Type a name in the lobby to create a reusable local player, or select a saved player. Players also lets you create accounts without starting a game. Every account has a stable local identity and an eight-character hexadecimal account ID. Equal names remain separate. A PIN or password is optional for local account settings; use a 4–8 digit PIN or an 8–64 byte password. Shared-table play remains available without signing in. PIN-protected account settings need unlocking after the app restarts.</ns0:t>
       </ns0:r>
     </ns0:p>
     <ns0:p>
@@ -4033,7 +4033,25 @@
     </ns0:p>
     <ns0:p>
       <ns0:r>
-        <ns0:t>The app plays short sounds for confirmed passes, game starts, pauses, resumes, victories and draws in both local and Atlas-connected play. Game sounds and Sound volume are available in table setup, the table menu and My account. They are saved on this phone and default to on at 50%. Phone silent/vibrate mode and media volume still apply. Sounds stop when the app leaves the foreground and do not replay on load, reconnect or return to the app. All actions still show on screen; sound is optional.</ns0:t>
+        <ns0:t>The app plays short sounds for confirmed passes, game starts, pauses, resumes, victories and draws in both local and Atlas-connected play. Game sounds and Sound volume are available in table setup, the table menu and Settings. They are saved on this phone and default to on at 50%. Phone silent/vibrate mode and media volume still apply. Sounds stop when the app leaves the foreground and do not replay on load, reconnect or return to the app. All actions still show on screen; sound is optional.</ns0:t>
+      </ns0:r>
+    </ns0:p>
+    <ns0:p>
+      <ns0:pPr/>
+      <ns0:r>
+        <ns0:t>Game menu groups table tools, game rules, sound/display, help and finishing the game. Player More cards hold counters, status, Commander damage and leaving the game, and stay available while paused. Pick an opponent is in that player’s card; it excludes that player, eliminated players, teammates and Star allies. Table tools offers every die from d4 through d20, a coin and a random player.</ns0:t>
+      </ns0:r>
+    </ns0:p>
+    <ns0:p>
+      <ns0:pPr/>
+      <ns0:r>
+        <ns0:t>Local turn timers include a 10-minute preset. Optional timeout actions pass automatically, add a demerit, or do both. Earned extensions are optional: after a player’s first three turns, an early pass can earn one. The default is before 75% of the limit, with at most two earned per game. Each extension adds half the turn limit; a turn can use one extension, and extended or expired turns earn none. These policies apply to device-hosted games.</ns0:t>
+      </ns0:r>
+    </ns0:p>
+    <ns0:p>
+      <ns0:pPr/>
+      <ns0:r>
+        <ns0:t>Player colors use named swatches and a custom visual picker. Changes save immediately. Life controls put minus on the player’s left and plus on their right, including rotated panels. The home header and bug-report card show the app version and build.</ns0:t>
       </ns0:r>
     </ns0:p>
     <ns0:p>
@@ -4054,7 +4072,7 @@
     </ns0:p>
     <ns0:p>
       <ns0:r>
-        <ns0:t>To import an account, connect to Atlas, open Accounts and history, load Atlas accounts and open the local account. Create this account on Atlas preserves its account ID and copies available personalization; it needs Atlas 0.7.15 or later and a PIN or password. If the local account already has a PIN, enter that same secret. To merge with an existing Atlas account, select it and verify its PIN or password. This saves a link for that Atlas and retains both histories; existing Atlas personalization stays unchanged. A matching name or an unverified account-ID collision never merges accounts.</ns0:t>
+        <ns0:t>To import an account, connect to Atlas, open Players &gt; Device, load Atlas accounts and open the local account. Create this account on Atlas preserves its account ID and copies available personalization; it needs Atlas 0.7.15 or later and a PIN or password. If the local account already has a PIN, enter that same secret. To merge with an existing Atlas account, select it and verify its PIN or password. This saves a link for that Atlas and retains both histories; existing Atlas personalization stays unchanged. A matching name or an unverified account-ID collision never merges accounts.</ns0:t>
       </ns0:r>
     </ns0:p>
     <ns0:p>
@@ -4067,7 +4085,7 @@
     </ns0:p>
     <ns0:p>
       <ns0:r>
-        <ns0:t>Open a local account to change its name, color, preset avatar, cropped player image or reduced-motion setting. Appearance themes are available offline too. Images are cropped and compressed on the phone to at most 512 by 512 pixels and 48 KiB. When copied to Atlas, its storage limits and image-approval policy still apply.</ns0:t>
+        <ns0:t>Open a local account to change its name, color, preset avatar, cropped player image or reduced-motion setting. Settings &gt; Appearance changes the theme immediately, with or without Atlas. Images are cropped and compressed on the phone to at most 512 by 512 pixels and 48 KiB. When copied to Atlas, its storage limits and image-approval policy still apply.</ns0:t>
       </ns0:r>
     </ns0:p>
     <ns0:p>
@@ -5629,7 +5647,7 @@
         <ns0:pStyle ns0:val="NormalWeb"/>
       </ns0:pPr>
       <ns0:r>
-        <ns0:t>Connect and sign in, then open Accounts and history. Games whose players have verified links to available accounts on that Atlas import automatically. For other matches, map every player manually. Names never select accounts. Rejected or partially credited results remain visible for review, and no import deletes the local result.</ns0:t>
+        <ns0:t>Connect and sign in, then open History. Games whose players have verified links to available accounts on that Atlas import automatically. For other matches, map every player manually. Names never select accounts. Rejected or partially credited results remain visible for review, and no import deletes the local result.</ns0:t>
       </ns0:r>
     </ns0:p>
     <ns0:p>

</xml_diff>

<commit_message>
Android: Table tab in the app, sliding tabs, player colors in design tokens
Table shows the device game's table inside the app (running, last game, or a
lobby preview) with Full screen as an explicit step. Tabs slide in bar order
unless motion is reduced. The version label moves from the header to Settings.
playerColors in design/tokens.json now feeds Android, CSS and device_theme.h.

Co-Authored-By: Claude Opus 5.5 (1M context) <noreply@anthropic.com>
Claude-Session: https://claude.ai/code/session_0116yChtZbdtgpRRjH5yUxki
</commit_message>
<xml_diff>
--- a/Documentation/User Manual/TurnHub Manual V0.20.docx
+++ b/Documentation/User Manual/TurnHub Manual V0.20.docx
@@ -1089,7 +1089,7 @@
         <ns0:pStyle ns0:val="NormalWeb"/>
       </ns0:pPr>
       <ns0:r>
-        <ns0:t>The TurnHub Android app is on Google Play through the prototype testing track. Game, Table, Players, History and Settings are available with or without Atlas. No Atlas, account or network permission is needed for local play. Table opens the full-screen view. Settings includes appearance, sound and Atlas connection. Atlas discovery stays in the background; Connect can join TurnHub-Atlas Wi-Fi using a saved or entered password.</ns0:t>
+        <ns0:t>The TurnHub Android app is on Google Play through the prototype testing track. Game, Table, Players, History and Settings are available with or without Atlas. No Atlas, account or network permission is needed for local play. Table shows the game’s table inside the app, or a preview of the seats before a game starts; Full screen gives it the whole screen. Settings includes appearance, sound and Atlas connection. Atlas discovery stays in the background; Connect can join TurnHub-Atlas Wi-Fi using a saved or entered password.</ns0:t>
       </ns0:r>
     </ns0:p>
     <ns0:p>
@@ -3982,7 +3982,7 @@
         <ns0:pStyle ns0:val="NormalWeb"/>
       </ns0:pPr>
       <ns0:r>
-        <ns0:t>The Android app opens to Game on a fresh launch. Add players and start, or open a saved game from Table. These same tabs remain available when Atlas connects. Game lets you choose This device or Atlas; Players adds Table and Me sections, and Settings adds authorized table administration. Turning off Atlas discovery disconnects it. Local games and Atlas games remain independent.</ns0:t>
+        <ns0:t>The Android app opens to Game on a fresh launch. Add players and start; the game opens in Table, and Full screen gives it the whole screen. These same tabs remain available when Atlas connects. Game lets you choose This device or Atlas; Players adds Table and Me sections, and Settings adds authorized table administration. Turning off Atlas discovery disconnects it. Local games and Atlas games remain independent.</ns0:t>
       </ns0:r>
     </ns0:p>
     <ns0:p>

</xml_diff>

<commit_message>
Android: practice table, Star layout option, banner icons, lobby regrouping
The Table tab plays a never-saved practice table before a game. Star
Commander can be seated in the setup's star (a per-device switch). Report a
bug and the manual are small banner buttons that name themselves. The mode's
seating help sits under the seat map; sounds and bug reports leave the in-app
lobby for Settings and the banner.

Co-Authored-By: Claude Opus 5.5 (1M context) <noreply@anthropic.com>
Claude-Session: https://claude.ai/code/session_0116yChtZbdtgpRRjH5yUxki
</commit_message>
<xml_diff>
--- a/Documentation/User Manual/TurnHub Manual V0.20.docx
+++ b/Documentation/User Manual/TurnHub Manual V0.20.docx
@@ -1089,7 +1089,7 @@
         <ns0:pStyle ns0:val="NormalWeb"/>
       </ns0:pPr>
       <ns0:r>
-        <ns0:t>The TurnHub Android app is on Google Play through the prototype testing track. Game, Table, Players, History and Settings are available with or without Atlas. No Atlas, account or network permission is needed for local play. Table shows the game’s table inside the app, or a preview of the seats before a game starts; Full screen gives it the whole screen. Settings includes appearance, sound and Atlas connection. Atlas discovery stays in the background; Connect can join TurnHub-Atlas Wi-Fi using a saved or entered password.</ns0:t>
+        <ns0:t>The TurnHub Android app is on Google Play through the prototype testing track. Game, Table, Players, History and Settings are available with or without Atlas. No Atlas, account or network permission is needed for local play. Table shows the game’s table inside the app. Before a game starts it is a practice table you can play freely; nothing on it is saved. Full screen gives a started game the whole screen. At the top of the app, the bug button reports a bug and the ? button opens this manual; long-press either to see its name. Settings includes appearance, sound and Atlas connection. Atlas discovery stays in the background; Connect can join TurnHub-Atlas Wi-Fi using a saved or entered password.</ns0:t>
       </ns0:r>
     </ns0:p>
     <ns0:p>
@@ -2064,7 +2064,7 @@
         </ns0:rPr>
       </ns0:pPr>
       <ns0:r>
-        <ns0:t>Each player’s panel shows Enemies out 1/2; the table menu shows the star, and tapping a player highlights their allies and enemies. Claiming a win for an alternate win condition works as usual. Two-Headed Giant isn’t available in Star Commander.</ns0:t>
+        <ns0:t>Each player’s panel shows Enemies out 1/2; the table menu shows the star, and tapping a player highlights their allies and enemies. Claiming a win for an alternate win condition works as usual. Two-Headed Giant isn’t available in Star Commander. Turn on Star layout (in the lobby, or Sound &amp; display in the table menu) to seat the game in the star itself, each panel facing its player; it suits a tablet or large screen.</ns0:t>
       </ns0:r>
     </ns0:p>
     <ns0:p>
@@ -4051,7 +4051,7 @@
     <ns0:p>
       <ns0:pPr/>
       <ns0:r>
-        <ns0:t>Player colors use named swatches and a custom visual picker. Changes save immediately. Life controls put minus on the player’s left and plus on their right, including rotated panels. The home header and bug-report card show the app version and build.</ns0:t>
+        <ns0:t>Player colors use named swatches and a custom visual picker. Changes save immediately. Life controls put minus on the player’s left and plus on their right, including rotated panels. The bug button at the top of the app shows the app version and build before it opens the bug form; Settings shows them too.</ns0:t>
       </ns0:r>
     </ns0:p>
     <ns0:p>

</xml_diff>

<commit_message>
Android: commander names, Scryfall card art and Sean Mode rematch
Players can optionally name their commander in any Commander mode; the name
shows under theirs and its Scryfall art crop fills their tile with artist
credit (cached, off via Settings > Commander card art). Finished five-player
Star Commander games offer Sean Mode, a rematch that reseats the table so
allies become enemies. Privacy policy, legal tracker, manual and docs updated.

Co-Authored-By: Claude Opus 5.5 (1M context) <noreply@anthropic.com>
Claude-Session: https://claude.ai/code/session_0116yChtZbdtgpRRjH5yUxki
</commit_message>
<xml_diff>
--- a/Documentation/User Manual/TurnHub Manual V0.20.docx
+++ b/Documentation/User Manual/TurnHub Manual V0.20.docx
@@ -2064,7 +2064,7 @@
         </ns0:rPr>
       </ns0:pPr>
       <ns0:r>
-        <ns0:t>Each player’s panel shows Enemies out 1/2; the table menu shows the star, and tapping a player highlights their allies and enemies. Claiming a win for an alternate win condition works as usual. Two-Headed Giant isn’t available in Star Commander. Turn on Star layout (in the lobby, or Sound &amp; display in the table menu) to seat the game in the star itself, each panel facing its player; it suits a tablet or large screen.</ns0:t>
+        <ns0:t>Each player’s panel shows Enemies out 1/2; the table menu shows the star, and tapping a player highlights their allies and enemies. Claiming a win for an alternate win condition works as usual. Two-Headed Giant isn’t available in Star Commander. Turn on Star layout (in the lobby, or Sound &amp; display in the table menu) to seat the game in the star itself, each panel facing its player; it suits a tablet or large screen. On a phone-hosted Star game, the game-over card also offers Sean Mode: a rematch that reseats the same five players so your allies become your enemies.</ns0:t>
       </ns0:r>
     </ns0:p>
     <ns0:p>
@@ -4067,7 +4067,7 @@
       </ns0:pPr>
       <ns0:r>
         <ns0:rPr/>
-        <ns0:t>The table looks and works like tablet mode (section 17): life, Commander damage, passing, pause, concede, the turn timer, Two-Headed Giant, Star Commander and the winners. There are no phones or Sigils in this mode. Tap First? next to a player in setup to choose who goes first (their team, in Two-Headed Giant); otherwise a random player starts, and a rematch always picks at random. For the first three minutes, Back to setup in the table menu (or while paused) undoes the start: it returns to setup with the same players and settings and saves nothing. A game that ends within a minute isn't added to history or stats; tap Count this game on the game-over card to keep it. Official modes (Magic, Commander, Two-Headed Giant and Yu-Gi-Oh!) use their official starting life, poison limit and player count unless House rules is on in setup; official Two-Headed Giant is two teams of two. Two-Headed Giant Commander, Star Commander and Other are custom modes. In Two-Headed Giant the More menu shows the team's shared poison once and one Our team concedes button, because a team leaves together; teammates can't deal each other Commander damage. ? Rules, in setup and the table menu, summarizes the mode's rules and links to the official rules.</ns0:t>
+        <ns0:t>The table looks and works like tablet mode (section 17): life, Commander damage, passing, pause, concede, the turn timer, Two-Headed Giant, Star Commander and the winners. There are no phones or Sigils in this mode. Tap First? next to a player in setup to choose who goes first (their team, in Two-Headed Giant); otherwise a random player starts, and a rematch always picks at random. For the first three minutes, Back to setup in the table menu (or while paused) undoes the start: it returns to setup with the same players and settings and saves nothing. A game that ends within a minute isn't added to history or stats; tap Count this game on the game-over card to keep it. Official modes (Magic, Commander, Two-Headed Giant and Yu-Gi-Oh!) use their official starting life, poison limit and player count unless House rules is on in setup; official Two-Headed Giant is two teams of two. Two-Headed Giant Commander, Star Commander and Other are custom modes. In Two-Headed Giant the More menu shows the team's shared poison once and one Our team concedes button, because a team leaves together; teammates can't deal each other Commander damage. ? Rules, in setup and the table menu, summarizes the mode’s rules and links to the official rules. In any Commander mode, Commander next to a player in setup lets them name their commander; it is optional, shows under their name and carries into rematches. A named commander’s card art from Scryfall fills the player’s tile, credited to its artist; only the name is sent, and Commander card art in Settings turns the lookups off.</ns0:t>
       </ns0:r>
     </ns0:p>
     <ns0:p>

</xml_diff>

<commit_message>
Android: Planechase in the standalone game (Planes tab)
A Planes tab appears for Magic formats on this device. Before a game it
turns on Planechase with TurnHub's shuffled shared deck (downloaded once from
Scryfall: names, rules text and art, credited to each artist) or the
players' own cards. During a game it shows the face-up plane, rolls the
planar die for the active player with each roll's cost, waits on phenomena,
keeps counters on the plane and offers the tools cards ask for.

The engine (standalone/Planechase.kt) follows CR 901, 311, 312 and 701.31,
and its rules are also written as shared scenarios in
protocol/scenarios/planechase/ that Atlas will run too. Docs, manual,
privacy policy and legal tracker updated.

Co-Authored-By: Claude Opus 5.5 (1M context) <noreply@anthropic.com>
Claude-Session: https://claude.ai/code/session_015pgCz2w9d8vAKBV5pRWV4u
</commit_message>
<xml_diff>
--- a/Documentation/User Manual/TurnHub Manual V0.20.docx
+++ b/Documentation/User Manual/TurnHub Manual V0.20.docx
@@ -4068,6 +4068,11 @@
       <ns0:r>
         <ns0:rPr/>
         <ns0:t>The table looks and works like tablet mode (section 17): life, Commander damage, passing, pause, concede, the turn timer, Two-Headed Giant, Star Commander and the winners. There are no phones or Sigils in this mode. Tap First? next to a player in setup to choose who goes first (their team, in Two-Headed Giant); otherwise a random player starts, and a rematch always picks at random. For the first three minutes, Back to setup in the table menu (or while paused) undoes the start: it returns to setup with the same players and settings and saves nothing. A game that ends within a minute isn't added to history or stats; tap Count this game on the game-over card to keep it. Official modes (Magic, Commander, Two-Headed Giant and Yu-Gi-Oh!) use their official starting life, poison limit and player count unless House rules is on in setup; official Two-Headed Giant is two teams of two. Two-Headed Giant Commander, Star Commander and Other are custom modes. In Two-Headed Giant the More menu shows the team's shared poison once and one Our team concedes button, because a team leaves together; teammates can't deal each other Commander damage. ? Rules, in setup and the table menu, summarizes the mode’s rules and links to the official rules. In any Commander mode, Commander next to a player in setup lets them name their commander; it is optional, shows under their name and carries into rematches. A named commander’s card art from Scryfall fills the player’s tile, credited to its artist; only the name is sent, and Commander card art in Settings turns the lookups off.</ns0:t>
+      </ns0:r>
+    </ns0:p>
+    <ns0:p>
+      <ns0:r>
+        <ns0:t>Planechase: in a Magic or Commander game a Planes tab appears. Before the game, turn on Play Planechase there and choose TurnHub's deck or Our own cards. TurnHub's deck downloads every plane and phenomenon from Scryfall once (names, rules text and art, each credited to its artist) and shuffles one shared planar deck for each game, with up to two phenomena per player when Include phenomena is on. During the game the Planes tab shows the face-up plane and rolls the planar die for the player whose turn it is. The button shows what the next roll costs; the cost goes back to {0} when the turn passes. Planeswalk turns over the next plane. A phenomenon waits until you tap Done: planeswalk away. Chaos highlights the plane's chaos ability. Counters on this plane, and the buttons under When a card says so, cover cards that roll the die, planeswalk, say chaos ensues or move the top card. With your own cards, TurnHub rolls and counts the cost and tells you when to turn over the next plane. Rolls and deck moves wait while the game is paused.</ns0:t>
       </ns0:r>
     </ns0:p>
     <ns0:p>

</xml_diff>

<commit_message>
Android: commander picker with art printings, names in game, merged player menu
The commander dialog suggests card names from Scryfall as the player types and
lists each printing's art to choose from; the pick is saved per player. Named
commanders label the commander-tax counter and Commander damage rows. The
player menu's turn and counters cards are one card, and the lobby buttons now
say what they do (Name commander, Tile color & photo).

Co-Authored-By: Claude Opus 5.5 (1M context) <noreply@anthropic.com>
Claude-Session: https://claude.ai/code/session_0116yChtZbdtgpRRjH5yUxki
</commit_message>
<xml_diff>
--- a/Documentation/User Manual/TurnHub Manual V0.20.docx
+++ b/Documentation/User Manual/TurnHub Manual V0.20.docx
@@ -4028,7 +4028,7 @@
     </ns0:p>
     <ns0:p>
       <ns0:r>
-        <ns0:t>Each player's Background button opens their tile settings. Choose Default, Solid, Gradient or a custom cropped image. Backgrounds follow the player across seats and games and stay separate from avatars. Images are saved on this phone at up to 512 by 512 pixels and 48 KiB. Account settings also offer tile backgrounds; an account PIN is required if one is set. A verified link to an Atlas account applies the same background on this phone's connected table.</ns0:t>
+        <ns0:t>Each player's Tile color &amp; photo button opens their tile settings. Choose Default, Solid, Gradient or a custom cropped image. Backgrounds follow the player across seats and games and stay separate from avatars. Images are saved on this phone at up to 512 by 512 pixels and 48 KiB. Account settings also offer tile backgrounds; an account PIN is required if one is set. A verified link to an Atlas account applies the same background on this phone's connected table.</ns0:t>
       </ns0:r>
     </ns0:p>
     <ns0:p>
@@ -4067,7 +4067,7 @@
       </ns0:pPr>
       <ns0:r>
         <ns0:rPr/>
-        <ns0:t>The table looks and works like tablet mode (section 17): life, Commander damage, passing, pause, concede, the turn timer, Two-Headed Giant, Star Commander and the winners. There are no phones or Sigils in this mode. Tap First? next to a player in setup to choose who goes first (their team, in Two-Headed Giant); otherwise a random player starts, and a rematch always picks at random. For the first three minutes, Back to setup in the table menu (or while paused) undoes the start: it returns to setup with the same players and settings and saves nothing. A game that ends within a minute isn't added to history or stats; tap Count this game on the game-over card to keep it. Official modes (Magic, Commander, Two-Headed Giant and Yu-Gi-Oh!) use their official starting life, poison limit and player count unless House rules is on in setup; official Two-Headed Giant is two teams of two. Two-Headed Giant Commander, Star Commander and Other are custom modes. In Two-Headed Giant the More menu shows the team's shared poison once and one Our team concedes button, because a team leaves together; teammates can't deal each other Commander damage. ? Rules, in setup and the table menu, summarizes the mode’s rules and links to the official rules. In any Commander mode, Commander next to a player in setup lets them name their commander; it is optional, shows under their name and carries into rematches. A named commander’s card art from Scryfall fills the player’s tile, credited to its artist; only the name is sent, and Commander card art in Settings turns the lookups off.</ns0:t>
+        <ns0:t>The table looks and works like tablet mode (section 17): life, Commander damage, passing, pause, concede, the turn timer, Two-Headed Giant, Star Commander and the winners. There are no phones or Sigils in this mode. Tap First? next to a player in setup to choose who goes first (their team, in Two-Headed Giant); otherwise a random player starts, and a rematch always picks at random. For the first three minutes, Back to setup in the table menu (or while paused) undoes the start: it returns to setup with the same players and settings and saves nothing. A game that ends within a minute isn't added to history or stats; tap Count this game on the game-over card to keep it. Official modes (Magic, Commander, Two-Headed Giant and Yu-Gi-Oh!) use their official starting life, poison limit and player count unless House rules is on in setup; official Two-Headed Giant is two teams of two. Two-Headed Giant Commander, Star Commander and Other are custom modes. In Two-Headed Giant the More menu shows the team's shared poison once and one Our team concedes button, because a team leaves together; teammates can't deal each other Commander damage. ? Rules, in setup and the table menu, summarizes the mode’s rules and links to the official rules. In any Commander mode, Name commander next to a player in setup lets them name their commander; it is optional, shows under their name, names their commander-tax counter and the Commander damage others take from it, and carries into rematches. As you type, matching card names from Scryfall are suggested; pick one to choose which printing’s art fills the player’s tile, credited to its artist. Only what you type is sent, and Commander card art in Settings turns the suggestions and art off.</ns0:t>
       </ns0:r>
     </ns0:p>
     <ns0:p>
@@ -6066,7 +6066,7 @@
     </ns0:p>
     <ns0:p>
       <ns0:r>
-        <ns0:t>Use Counters and status in your player controls or the More drawer on a table tile. Poison, energy and experience have plus/minus controls; minus corrects or spends a counter. Two-Headed Giant shares poison across the team. Table tiles show poison and active status markers.</ns0:t>
+        <ns0:t>Use the counters in your player controls or the Turn, counters &amp; status card in a table tile’s More menu. Poison, energy and experience have plus/minus controls; minus corrects or spends a counter. Two-Headed Giant shares poison across the team. Table tiles show poison and active status markers.</ns0:t>
       </ns0:r>
     </ns0:p>
     <ns0:p>

</xml_diff>

<commit_message>
Clarify planar deck labels and table navigation icons
</commit_message>
<xml_diff>
--- a/Documentation/User Manual/TurnHub Manual V0.20.docx
+++ b/Documentation/User Manual/TurnHub Manual V0.20.docx
@@ -3811,7 +3811,7 @@
         <ns0:rPr>
           <ns0:b/>
         </ns0:rPr>
-        <ns0:t>Hold to pass</ns0:t>
+        <ns0:t>Pass</ns0:t>
       </ns0:r>
       <ns0:r>
         <ns0:rPr/>
@@ -4072,7 +4072,7 @@
     </ns0:p>
     <ns0:p>
       <ns0:r>
-        <ns0:t>Planechase: in a Magic or Commander game a Planes tab appears. Before the game, turn on Play Planechase there and choose TurnHub's deck or Our own cards. TurnHub's deck downloads every plane and phenomenon from Scryfall once (names, rules text and art, each credited to its artist) and shuffles one shared planar deck for each game, with up to two phenomena per player when Include phenomena is on. During the game the Planes tab shows the face-up plane and rolls the planar die for the player whose turn it is. The button shows what the next roll costs; the cost goes back to {0} when the turn passes. Planeswalk turns over the next plane. A phenomenon waits until you tap Done: planeswalk away. Chaos highlights the plane's chaos ability. Counters on this plane, and the buttons under When a card says so, cover cards that roll the die, planeswalk, say chaos ensues or move the top card. With your own cards, TurnHub rolls and counts the cost and tells you when to turn over the next plane. Rolls and deck moves wait while the game is paused.</ns0:t>
+        <ns0:t>Planechase: in a Magic or Commander game a Planes tab appears. Before the game, turn on Play Planechase there and choose Digital deck or Physical cards. The digital deck downloads every plane and phenomenon from Scryfall once (names, rules text and art, each credited to its artist) and shuffles one shared planar deck for each game, with up to two phenomena per player when Include phenomena is on. During the game the Planes tab shows the face-up plane and rolls the planar die for the player whose turn it is. The button shows what the next roll costs; the cost goes back to {0} when the turn passes. Planeswalk turns over the next plane. A phenomenon waits until you tap Done: planeswalk away. Chaos highlights the plane's chaos ability. Counters on this plane, and the buttons under When a card says so, cover cards that roll the die, planeswalk, say chaos ensues or move the top card. With physical cards, TurnHub rolls and counts the cost and tells you when to turn over the next plane. Rolls and deck moves wait while the game is paused.</ns0:t>
       </ns0:r>
     </ns0:p>
     <ns0:p>

</xml_diff>

<commit_message>
Add start countdown and table planar die flow
</commit_message>
<xml_diff>
--- a/Documentation/User Manual/TurnHub Manual V0.20.docx
+++ b/Documentation/User Manual/TurnHub Manual V0.20.docx
@@ -3740,7 +3740,7 @@
       </ns0:r>
       <ns0:r>
         <ns0:rPr/>
-        <ns0:t xml:space="preserve"> in My account. The table preview stays visible while players join. Drag one player onto another seat, or tap two seats, to swap them; panels sit clockwise in number order. Tap First? next to a player to choose who goes first, and tap it again to clear the choice; otherwise Atlas picks a random player. Clear all removes seated accounts through Atlas. Saved accounts remain available. During the first three minutes of a game, Back to setup in the table menu (or while paused) returns to the lobby with the same players and settings and saves nothing. A game that ends within a minute isn't added to stats until someone taps Count this game on the game-over card. Then choose the game, starting life and Two-Headed Giant, and tap </ns0:t>
+        <ns0:t xml:space="preserve"> in My account. The table preview stays visible while players join. Drag one player onto another seat, or tap two seats, to swap them; panels sit clockwise in number order. Tap First? next to a player to choose who goes first, and tap it again to clear the choice; otherwise Atlas picks a random player. Clear all removes seated accounts through Atlas. Saved accounts remain available. During the first three minutes of a game, Back to setup in the table menu (or while paused) returns to the Game tab with the same players and settings and saves nothing. A game that ends within a minute isn't added to stats until someone taps Count this game on the game-over card. Then choose the game, starting life and Two-Headed Giant, and tap </ns0:t>
       </ns0:r>
       <ns0:r>
         <ns0:rPr>
@@ -4067,12 +4067,12 @@
       </ns0:pPr>
       <ns0:r>
         <ns0:rPr/>
-        <ns0:t>The table looks and works like tablet mode (section 17): life, Commander damage, passing, pause, concede, the turn timer, Two-Headed Giant, Star Commander and the winners. There are no phones or Sigils in this mode. Tap First? next to a player in setup to choose who goes first (their team, in Two-Headed Giant); otherwise a random player starts, and a rematch always picks at random. For the first three minutes, Back to setup in the table menu (or while paused) undoes the start: it returns to setup with the same players and settings and saves nothing. A game that ends within a minute isn't added to history or stats; tap Count this game on the game-over card to keep it. Official modes (Magic, Commander, Two-Headed Giant and Yu-Gi-Oh!) use their official starting life, poison limit and player count unless House rules is on in setup; official Two-Headed Giant is two teams of two. Two-Headed Giant Commander, Star Commander and Other are custom modes. In Two-Headed Giant the More menu shows the team's shared poison once and one Our team concedes button, because a team leaves together; teammates can't deal each other Commander damage. ? Rules, in setup and the table menu, summarizes the mode’s rules and links to the official rules. In any Commander mode, Name commander next to a player in setup lets them name their commander; it is optional, shows under their name, names their commander-tax counter and the Commander damage others take from it, and carries into rematches. As you type, matching card names from Scryfall are suggested; pick one to choose which printing’s art fills the player’s tile, credited to its artist. Only what you type is sent, and Commander card art in Settings turns the suggestions and art off.</ns0:t>
-      </ns0:r>
-    </ns0:p>
-    <ns0:p>
-      <ns0:r>
-        <ns0:t>Planechase: in a Magic or Commander game a Planes tab appears. Before the game, turn on Play Planechase there and choose Digital deck or Physical cards. The digital deck downloads planes and phenomena from Scryfall (names, rules text, release collections and art, each credited to its artist). Choose All planes or Collection, including Planechase Anthology. Browse &amp; build lets you search cards, filter by collection or Selected only, and check cards to include. Add shown and Remove shown change the filtered cards. Preview opens the art and rules; Previous and Next thumb through the filtered list, with Add card or Remove card for each. Name the deck and choose Save &amp; use deck to keep it on this phone; up to 20 decks can be saved. Saving the same name replaces that deck. Use selects a saved deck; Delete removes its saved preset while keeping the current choice. A custom deck needs at least one plane; small decks are allowed for casual play. Choose the pool before starting: the current game keeps its deck through reopening, and rematches shuffle the same pool. Refresh library downloads new cards and collection membership. Browsing works offline after download, except uncached art previews need internet. Each game shuffles the chosen planes, with up to two selected phenomena per player when Include phenomena is on. During the game the Planes tab shows the face-up plane and rolls the planar die for the player whose turn it is. The button shows what the next roll costs; the cost goes back to {0} when the turn passes. Planeswalk turns over the next plane. A phenomenon waits until you tap Done: planeswalk away. Chaos highlights the plane's chaos ability. Counters on this plane, and the buttons under When a card says so, cover cards that roll the die, planeswalk, say chaos ensues or move the top card. With physical cards, TurnHub rolls and counts the cost and tells you when to turn over the next plane. Rolls and deck moves wait while the game is paused.</ns0:t>
+        <ns0:t>The table looks and works like tablet mode (section 17): life, Commander damage, passing, pause, concede, the turn timer, Two-Headed Giant, Star Commander and the winners. There are no phones or Sigils in this mode. Tap First? next to a player in setup to choose who goes first (their team, in Two-Headed Giant); otherwise a random player starts, and a rematch always picks at random. For the first three minutes, Back to setup in the table menu (or while paused) undoes the start: it returns to the Game tab with the same players and settings and saves nothing. Local starts and rematches show a three-second countdown before the clocks start. Cancel or Back stops the countdown; leaving the screen or backgrounding the app also cancels it. A game that ends within a minute isn't added to history or stats; tap Count this game on the game-over card to keep it. Official modes (Magic, Commander, Two-Headed Giant and Yu-Gi-Oh!) use their official starting life, poison limit and player count unless House rules is on in setup; official Two-Headed Giant is two teams of two. Two-Headed Giant Commander, Star Commander and Other are custom modes. In Two-Headed Giant the More menu shows the team's shared poison once and one Our team concedes button, because a team leaves together; teammates can't deal each other Commander damage. ? Rules, in setup and the table menu, summarizes the mode’s rules and links to the official rules. In any Commander mode, Name commander next to a player in setup lets them name their commander; it is optional, shows under their name, names their commander-tax counter and the Commander damage others take from it, and carries into rematches. As you type, matching card names from Scryfall are suggested; pick one to choose which printing’s art fills the player’s tile, credited to its artist. Only what you type is sent, and Commander card art in Settings turns the suggestions and art off.</ns0:t>
+      </ns0:r>
+    </ns0:p>
+    <ns0:p>
+      <ns0:r>
+        <ns0:t>Planechase: in a Magic or Commander game a Planes tab appears. Before the game, turn on Play Planechase there and choose Digital deck or Physical cards. The digital deck downloads planes and phenomena from Scryfall (names, rules text, release collections and art, each credited to its artist). Choose All planes or Collection, including Planechase Anthology. Browse &amp; build lets you search cards, filter by collection or Selected only, and check cards to include. Add shown and Remove shown change the filtered cards. Preview opens the art and rules; Previous and Next thumb through the filtered list, with Add card or Remove card for each. Name the deck and choose Save &amp; use deck to keep it on this phone; up to 20 decks can be saved. Saving the same name replaces that deck. Use selects a saved deck; Delete removes its saved preset while keeping the current choice. A custom deck needs at least one plane; small decks are allowed for casual play. Choose the pool before starting: the current game keeps its deck through reopening, and rematches shuffle the same pool. Refresh library downloads new cards and collection membership. Browsing works offline after download, except uncached art previews need internet. Each game shuffles the chosen planes, with up to two selected phenomena per player when Include phenomena is on. During the game the Planes tab shows the face-up plane and rolls the planar die for the player whose turn it is. The button shows what the next roll costs; the cost goes back to {0} when the turn passes. Planeswalk turns over the next plane. A phenomenon waits until you tap Done: planeswalk away. Chaos highlights the plane's chaos ability. On the live table, Planar die beside Pass shows a roll animation. Blank keeps you on Table; chaos or planeswalk opens Planes with the effect highlighted. Counters on this plane, and the buttons under When a card says so, cover cards that roll the die, planeswalk, say chaos ensues or move the top card. With physical cards, TurnHub rolls and counts the cost and tells you when to turn over the next plane. Rolls and deck moves wait while the game is paused.</ns0:t>
       </ns0:r>
     </ns0:p>
     <ns0:p>

</xml_diff>

<commit_message>
Prefill concise bug reports with app and device details
</commit_message>
<xml_diff>
--- a/Documentation/User Manual/TurnHub Manual V0.20.docx
+++ b/Documentation/User Manual/TurnHub Manual V0.20.docx
@@ -1,6 +1,6 @@
 
 <file path=word/document.xml><?xml version="1.0" encoding="utf-8"?>
-<ns0:document xmlns:ns0="http://schemas.openxmlformats.org/wordprocessingml/2006/main" xmlns:ns1="http://schemas.openxmlformats.org/markup-compatibility/2006" xmlns:ns2="http://schemas.openxmlformats.org/drawingml/2006/wordprocessingDrawing" xmlns:ns3="http://schemas.openxmlformats.org/drawingml/2006/main" xmlns:ns4="http://schemas.microsoft.com/office/word/2010/wordprocessingShape" xmlns:ns5="urn:schemas-microsoft-com:vml" xmlns:ns6="http://schemas.microsoft.com/office/word/2010/wordml" xmlns:ns7="urn:schemas-microsoft-com:office:office" xmlns:ns8="urn:schemas-microsoft-com:office:word" xmlns:ns9="http://schemas.openxmlformats.org/officeDocument/2006/relationships" ns1:Ignorable="w14 w15 w16se w16cid w16 w16cex w16sdtdh w16sdtfl w16du wp14">
+<ns0:document xmlns:ns0="http://schemas.openxmlformats.org/wordprocessingml/2006/main" xmlns:ns1="http://schemas.openxmlformats.org/markup-compatibility/2006" xmlns:ns2="http://schemas.openxmlformats.org/officeDocument/2006/relationships" ns1:Ignorable="w14 w15 w16se w16cid w16 w16cex w16sdtdh w16sdtfl w16du wp14">
   <ns0:body>
     <ns0:p>
       <ns0:pPr>
@@ -4051,7 +4051,7 @@
     <ns0:p>
       <ns0:pPr/>
       <ns0:r>
-        <ns0:t>Player colors use named swatches and a custom visual picker. Changes save immediately. Life controls put minus on the player’s left and plus on their right, including rotated panels. The bug button at the top of the app shows the app version and build before it opens the bug form; Settings shows them too.</ns0:t>
+        <ns0:t>Player colors use named swatches and a custom visual picker. Changes save immediately. Life controls put minus on the player’s left and plus on their right, including rotated panels. The bug button previews the app version and device, then opens a Google Form with app version/build, phone/tablet type, Android version and available play details filled in. Check the answers and change the issue device to Physical Atlas if needed. Expected result and frequency are optional. Google collects your signed-in email address when you submit; the app does not submit reports automatically.</ns0:t>
       </ns0:r>
     </ns0:p>
     <ns0:p>
@@ -6128,8 +6128,8 @@
       </ns0:r>
     </ns0:p>
     <ns0:sectPr ns0:rsidR="00AB3509">
-      <ns0:headerReference ns0:type="default" ns9:id="rId7"/>
-      <ns0:footerReference ns0:type="default" ns9:id="rId8"/>
+      <ns0:headerReference ns0:type="default" ns2:id="rId7"/>
+      <ns0:footerReference ns0:type="default" ns2:id="rId8"/>
       <ns0:pgSz ns0:w="12240" ns0:h="15840"/>
       <ns0:pgMar ns0:top="1440" ns0:right="1440" ns0:bottom="1440" ns0:left="1440" ns0:header="720" ns0:footer="720" ns0:gutter="0"/>
       <ns0:cols ns0:space="720"/>

</xml_diff>